<commit_message>
test(acceptance): cap nhat danh sach loi kiem thu sprint 3 dot 2
</commit_message>
<xml_diff>
--- a/docs/Sprint_3_Danh_Sach_Loi_QA.docx
+++ b/docs/Sprint_3_Danh_Sach_Loi_QA.docx
@@ -117,12 +117,12 @@
                 <wp:inline distB="114300" distT="114300" distL="114300" distR="114300">
                   <wp:extent cx="4248150" cy="1657350"/>
                   <wp:effectExtent b="0" l="0" r="0" t="0"/>
-                  <wp:docPr id="3" name="image2.png"/>
+                  <wp:docPr id="3" name="image1.png"/>
                   <a:graphic>
                     <a:graphicData uri="http://schemas.openxmlformats.org/drawingml/2006/picture">
                       <pic:pic>
                         <pic:nvPicPr>
-                          <pic:cNvPr id="0" name="image2.png"/>
+                          <pic:cNvPr id="0" name="image1.png"/>
                           <pic:cNvPicPr preferRelativeResize="0"/>
                         </pic:nvPicPr>
                         <pic:blipFill>
@@ -305,12 +305,12 @@
           <wp:inline distB="114300" distT="114300" distL="114300" distR="114300">
             <wp:extent cx="5731200" cy="1676400"/>
             <wp:effectExtent b="0" l="0" r="0" t="0"/>
-            <wp:docPr id="5" name="image1.png"/>
+            <wp:docPr id="5" name="image2.png"/>
             <a:graphic>
               <a:graphicData uri="http://schemas.openxmlformats.org/drawingml/2006/picture">
                 <pic:pic>
                   <pic:nvPicPr>
-                    <pic:cNvPr id="0" name="image1.png"/>
+                    <pic:cNvPr id="0" name="image2.png"/>
                     <pic:cNvPicPr preferRelativeResize="0"/>
                   </pic:nvPicPr>
                   <pic:blipFill>
@@ -400,12 +400,12 @@
           <wp:inline distB="114300" distT="114300" distL="114300" distR="114300">
             <wp:extent cx="5731200" cy="3987800"/>
             <wp:effectExtent b="0" l="0" r="0" t="0"/>
-            <wp:docPr id="8" name="image7.png"/>
+            <wp:docPr id="8" name="image4.png"/>
             <a:graphic>
               <a:graphicData uri="http://schemas.openxmlformats.org/drawingml/2006/picture">
                 <pic:pic>
                   <pic:nvPicPr>
-                    <pic:cNvPr id="0" name="image7.png"/>
+                    <pic:cNvPr id="0" name="image4.png"/>
                     <pic:cNvPicPr preferRelativeResize="0"/>
                   </pic:nvPicPr>
                   <pic:blipFill>
@@ -705,12 +705,12 @@
           <wp:inline distB="114300" distT="114300" distL="114300" distR="114300">
             <wp:extent cx="5162550" cy="5991225"/>
             <wp:effectExtent b="0" l="0" r="0" t="0"/>
-            <wp:docPr id="6" name="image4.png"/>
+            <wp:docPr id="6" name="image8.png"/>
             <a:graphic>
               <a:graphicData uri="http://schemas.openxmlformats.org/drawingml/2006/picture">
                 <pic:pic>
                   <pic:nvPicPr>
-                    <pic:cNvPr id="0" name="image4.png"/>
+                    <pic:cNvPr id="0" name="image8.png"/>
                     <pic:cNvPicPr preferRelativeResize="0"/>
                   </pic:nvPicPr>
                   <pic:blipFill>
@@ -800,12 +800,12 @@
           <wp:inline distB="114300" distT="114300" distL="114300" distR="114300">
             <wp:extent cx="5731200" cy="3911600"/>
             <wp:effectExtent b="0" l="0" r="0" t="0"/>
-            <wp:docPr id="4" name="image8.png"/>
+            <wp:docPr id="4" name="image6.png"/>
             <a:graphic>
               <a:graphicData uri="http://schemas.openxmlformats.org/drawingml/2006/picture">
                 <pic:pic>
                   <pic:nvPicPr>
-                    <pic:cNvPr id="0" name="image8.png"/>
+                    <pic:cNvPr id="0" name="image6.png"/>
                     <pic:cNvPicPr preferRelativeResize="0"/>
                   </pic:nvPicPr>
                   <pic:blipFill>
@@ -923,6 +923,22 @@
       </w:pPr>
       <w:r>
         <w:rPr>
+          <w:rtl w:val="0"/>
+        </w:rPr>
+      </w:r>
+    </w:p>
+    <w:p>
+      <w:pPr>
+        <w:rPr>
+          <w:rFonts w:ascii="Times New Roman" w:cs="Times New Roman" w:eastAsia="Times New Roman" w:hAnsi="Times New Roman"/>
+          <w:b w:val="1"/>
+          <w:bCs w:val="1"/>
+          <w:sz w:val="32"/>
+          <w:szCs w:val="32"/>
+        </w:rPr>
+      </w:pPr>
+      <w:r>
+        <w:rPr>
           <w:rFonts w:ascii="Times New Roman" w:cs="Times New Roman" w:eastAsia="Times New Roman" w:hAnsi="Times New Roman"/>
           <w:b w:val="1"/>
           <w:bCs w:val="1"/>
@@ -955,12 +971,12 @@
           <wp:inline distB="114300" distT="114300" distL="114300" distR="114300">
             <wp:extent cx="5731200" cy="3251200"/>
             <wp:effectExtent b="0" l="0" r="0" t="0"/>
-            <wp:docPr id="1" name="image6.png"/>
+            <wp:docPr id="1" name="image7.png"/>
             <a:graphic>
               <a:graphicData uri="http://schemas.openxmlformats.org/drawingml/2006/picture">
                 <pic:pic>
                   <pic:nvPicPr>
-                    <pic:cNvPr id="0" name="image6.png"/>
+                    <pic:cNvPr id="0" name="image7.png"/>
                     <pic:cNvPicPr preferRelativeResize="0"/>
                   </pic:nvPicPr>
                   <pic:blipFill>

</xml_diff>